<commit_message>
Revise Section 2.2.1 to cite Williamson (1985) directly
Co-Authored-By: Claude Opus 5.5 <noreply@anthropic.com>
Claude-Session: https://claude.ai/code/session_01D75XZCNXPUXwLshn5jBJpA
</commit_message>
<xml_diff>
--- a/thesis/第2章_2.2_取引費用論.docx
+++ b/thesis/第2章_2.2_取引費用論.docx
@@ -51,27 +51,16 @@
         <w:jc w:val="both"/>
       </w:pPr>
       <w:r>
-        <w:t xml:space="preserve">第一の限定合理性とは、人間は「合理的であろうと意図されてはいるが，かぎられた程度でしか合理的ではありえない」という考え方である（Simon，1961，p.xxiv；武田，2013，320頁より引用）。そのため、将来起こりうるあらゆる事態を事前に予測し、契約に書き込むことはできず、契約は不完備なものとならざるを得ない（Williamson，1991，278頁）。第二の機会主義とは、「自己の利益を悪がしこいやり方で追求する」行動を指す（Williamson，1975，p.26；武田，2013，320頁より引用）</w:t>
-      </w:r>
-      <w:r>
-        <w:rPr>
-          <w:highlight w:val="yellow"/>
-          <w:highlightCs w:val="yellow"/>
-        </w:rPr>
-        <w:t xml:space="preserve">【要確認：邦訳『市場と企業組織』44頁で原文を確認】</w:t>
-      </w:r>
-      <w:r>
-        <w:t xml:space="preserve">。取引相手が多数存在すれば、相手を変更することで機会主義的な行動を抑止できる。しかし、取引相手が少数に限られると、相手を調査したり、詳細な契約を結んだり、契約後に履行を監視したりする必要が生じ、その分だけ取引費用が高まる（武田，2013，320頁）。さらに、取引の不確実性や複雑性が限定合理性と結びつき、取引の少数性が機会主義と結びつくことで、取引費用は一層高まるとされる（Williamson，1975，p.40；武田，2013，321頁）</w:t>
-      </w:r>
-      <w:r>
-        <w:rPr>
-          <w:highlight w:val="yellow"/>
-          <w:highlightCs w:val="yellow"/>
-        </w:rPr>
-        <w:t xml:space="preserve">【要確認：邦訳65頁】</w:t>
-      </w:r>
-      <w:r>
-        <w:t xml:space="preserve">。</w:t>
+        <w:t xml:space="preserve">第一の限定合理性とは、人間は合理的であろうと意図するものの、その合理性には限界がある（"intendedly rational, but only limitedly so"）という考え方である（Simon，1961，p.xxiv；Williamson，1985，30頁より引用）。第二の機会主義とは、狡猾さを伴って自己の利益を追求すること（self-interest seeking with guile）を指す（Williamson，1985，30頁）。取引相手が多数存在すれば、相手を変更することで機会主義的な行動を抑止できる。しかし、取引相手が少数に限られると、相手を調査したり、詳細な契約を結んだり、契約後に履行を監視したりする必要が生じ、その分だけ取引費用が高まる（武田，2013，320頁）。</w:t>
+      </w:r>
+    </w:p>
+    <w:p>
+      <w:pPr>
+        <w:ind w:firstLine="210"/>
+        <w:jc w:val="both"/>
+      </w:pPr>
+      <w:r>
+        <w:t xml:space="preserve">Williamson（1985，30-32頁）は、不確実性が存在することを前提としたうえで、限定合理性、機会主義、資産特殊性の三つが同時に存在する場合には、事前の計画は必然的に不完全となり、約束は守られなくなるおそれがあり、取引相手が誰であるかが重要になると論じている。このような状況では、裁判所による契約の執行には限界があるため、当事者間の私的な統治の仕組みが重要になる（Williamson，1985，32頁）。そこでの組織上の課題は、限定合理性を節約しつつ、機会主義の危険から取引を保護するように取引を組織することである（同上）。</w:t>
       </w:r>
     </w:p>
     <w:p>

</xml_diff>

<commit_message>
Trim Section 2.2.1 for length
Co-Authored-By: Claude Opus 5.5 <noreply@anthropic.com>
Claude-Session: https://claude.ai/code/session_01D75XZCNXPUXwLshn5jBJpA
</commit_message>
<xml_diff>
--- a/thesis/第2章_2.2_取引費用論.docx
+++ b/thesis/第2章_2.2_取引費用論.docx
@@ -33,34 +33,25 @@
         <w:jc w:val="both"/>
       </w:pPr>
       <w:r>
-        <w:t xml:space="preserve">取引費用論の出発点は、Coase（1937）の問題提起にある。新古典派経済学では、資源配分は価格メカニズムによって調整されると想定されてきた。これに対してCoase（1937，390頁）は、企業が設立される主な理由は、価格メカニズムを利用するための費用が存在することにあると論じた。市場で取引を行うには、適切な価格を見いだす費用や、取引ごとに契約を交渉・締結する費用がかかる（Coase，1937，390-391頁）。そのため、一部の取引を企業の内部に取り込むことで、こうした費用を節約できる場合がある。そして企業は、追加的な取引を企業内部で組織化する費用が、同じ取引を市場で行う費用と等しくなるところまで拡大するとされる（Coase，1937，395頁）。鈴木（2006）にもとづく武田（2013，317-318頁）の整理によれば、取引費用には、取引相手の探索、交渉、契約作成といった取引前の費用と、契約が守られているかのモニタリングや、契約不履行の際の執行といった取引後の費用が含まれる。</w:t>
-      </w:r>
-    </w:p>
-    <w:p>
-      <w:pPr>
-        <w:ind w:firstLine="210"/>
-        <w:jc w:val="both"/>
-      </w:pPr>
-      <w:r>
-        <w:t xml:space="preserve">ただし、Coaseは市場での取引になぜ費用が生じるのかを必ずしも明確にしなかった。この点を、人間行動の特性から説明したのがWilliamsonである（武田，2013，324頁）。Williamsonは、限定合理性と機会主義という二つの特性を、取引費用を発生させる根本的な要因とした（武田，2013，319頁）。</w:t>
-      </w:r>
-    </w:p>
-    <w:p>
-      <w:pPr>
-        <w:ind w:firstLine="210"/>
-        <w:jc w:val="both"/>
-      </w:pPr>
-      <w:r>
-        <w:t xml:space="preserve">第一の限定合理性とは、人間は合理的であろうと意図するものの、その合理性には限界がある（"intendedly rational, but only limitedly so"）という考え方である（Simon，1961，p.xxiv；Williamson，1985，30頁より引用）。第二の機会主義とは、狡猾さを伴って自己の利益を追求すること（self-interest seeking with guile）を指す（Williamson，1985，30頁）。取引相手が多数存在すれば、相手を変更することで機会主義的な行動を抑止できる。しかし、取引相手が少数に限られると、相手を調査したり、詳細な契約を結んだり、契約後に履行を監視したりする必要が生じ、その分だけ取引費用が高まる（武田，2013，320頁）。</w:t>
-      </w:r>
-    </w:p>
-    <w:p>
-      <w:pPr>
-        <w:ind w:firstLine="210"/>
-        <w:jc w:val="both"/>
-      </w:pPr>
-      <w:r>
-        <w:t xml:space="preserve">Williamson（1985，30-32頁）は、不確実性が存在することを前提としたうえで、限定合理性、機会主義、資産特殊性の三つが同時に存在する場合には、事前の計画は必然的に不完全となり、約束は守られなくなるおそれがあり、取引相手が誰であるかが重要になると論じている。このような状況では、裁判所による契約の執行には限界があるため、当事者間の私的な統治の仕組みが重要になる（Williamson，1985，32頁）。そこでの組織上の課題は、限定合理性を節約しつつ、機会主義の危険から取引を保護するように取引を組織することである（同上）。</w:t>
+        <w:t xml:space="preserve">取引費用論の出発点は、Coase（1937）の問題提起にある。Coase（1937，390-391頁）は、企業が設立される主な理由を、価格メカニズムを利用するための費用、すなわち適切な価格を見いだす費用や、取引ごとに契約を交渉・締結する費用の存在に求めた。そして企業は、追加的な取引を企業内部で組織化する費用が、同じ取引を市場で行う費用と等しくなるところまで拡大するとされる（Coase，1937，394-395頁）。鈴木（2006）にもとづく武田（2013，317-318頁）の整理によれば、取引費用には、取引相手の探索、交渉、契約作成といった取引前の費用と、契約履行のモニタリングや執行といった取引後の費用が含まれる。</w:t>
+      </w:r>
+    </w:p>
+    <w:p>
+      <w:pPr>
+        <w:ind w:firstLine="210"/>
+        <w:jc w:val="both"/>
+      </w:pPr>
+      <w:r>
+        <w:t xml:space="preserve">Coaseが必ずしも明確にしなかった、取引に費用が生じる理由を、Williamsonは人間行動の二つの特性、すなわち限定合理性と機会主義に求めた（武田，2013，324頁）。限定合理性とは、人間は合理的であろうと意図するものの、その合理性には限界がある（"intendedly rational, but only limitedly so"）ことを指す（Simon，1961，p.xxiv；Williamson，1985，30頁より引用）。機会主義とは、狡猾さを伴って自己の利益を追求すること（self-interest seeking with guile）である（Williamson，1985，30頁）。</w:t>
+      </w:r>
+    </w:p>
+    <w:p>
+      <w:pPr>
+        <w:ind w:firstLine="210"/>
+        <w:jc w:val="both"/>
+      </w:pPr>
+      <w:r>
+        <w:t xml:space="preserve">Williamson（1985，30-32頁）によれば、不確実性のもとで限定合理性、機会主義、資産特殊性の三つが同時に存在すると、事前の計画は不完全となり、約束は守られないおそれがあり、取引相手が誰であるかが重要になる。この場合、裁判所による契約の執行には限界があるため、当事者間の私的な統治の仕組みが必要となる。そこでの課題は、限定合理性を節約しつつ、機会主義の危険から取引を保護するように取引を組織することである（Williamson，1985，32頁）。</w:t>
       </w:r>
     </w:p>
     <w:p>

</xml_diff>

<commit_message>
Revise Section 2.2.3 and apply pending wording fixes
Co-Authored-By: Claude Opus 5.5 <noreply@anthropic.com>
Claude-Session: https://claude.ai/code/session_01D75XZCNXPUXwLshn5jBJpA
</commit_message>
<xml_diff>
--- a/thesis/第2章_2.2_取引費用論.docx
+++ b/thesis/第2章_2.2_取引費用論.docx
@@ -42,7 +42,7 @@
         <w:jc w:val="both"/>
       </w:pPr>
       <w:r>
-        <w:t xml:space="preserve">Coaseが必ずしも明確にしなかった、取引に費用が生じる理由を、Williamsonは人間行動の二つの特性、すなわち限定合理性と機会主義に求めた（武田，2013，324頁）。限定合理性とは、人間は合理的であろうと意図するものの、その合理性には限界がある（"intendedly rational, but only limitedly so"）ことを指す（Simon，1961，p.xxiv；Williamson，1985，30頁より引用）。機会主義とは、狡猾さを伴って自己の利益を追求すること（self-interest seeking with guile）である（Williamson，1985，30頁）。</w:t>
+        <w:t xml:space="preserve">Coaseが必ずしも明確にしなかった、市場での取引に費用が生じる理由を、Williamsonは人間行動の二つの特性、すなわち限定合理性と機会主義に求めた（武田，2013，324頁）。限定合理性とは、人間は合理的であろうと意図するものの、その合理性には限界がある（"intendedly rational, but only limitedly so"）ことを指す（Simon，1961，p.xxiv；Williamson，1985，30頁より引用）。機会主義とは、狡猾さを伴って自己の利益を追求すること（self-interest seeking with guile）である（Williamson，1985，30頁）。</w:t>
       </w:r>
     </w:p>
     <w:p>
@@ -77,7 +77,7 @@
         <w:jc w:val="both"/>
       </w:pPr>
       <w:r>
-        <w:t xml:space="preserve">資産特殊性とは、ある資産を、その生産的価値を損なうことなく、別の用途や別の使用者に転用できる程度を指す（Williamson，1991，281頁）。言い換えれば、特定の取引のために行われた投資が、他の用途や取引相手に転用された場合にどれだけ価値を失うかを示す概念である（Williamson，1991，282頁）。Williamson（1991，281-282頁）は資産特殊性を、①工程を隣接させて在庫や輸送の費用を節約する立地特殊性、②特殊な金型のような物的資産特殊性、③経験を通じた学習によって生じる人的資産特殊性、④ブランド資本、⑤特定の顧客の要請に応じて汎用的な設備に行われる投資である専用資産、⑥現場での適時の対応が不可欠となる時間的特殊性の六つに分類している。⑤の専用資産が示すように、汎用的な設備であっても、特定の顧客のために投資された場合には特殊性をもつ。すなわち資産特殊性は、資産が標準的なものか否かだけで決まるものではない。こうした資産特殊性、とりわけ①から⑤の形態は、取引当事者の間に双方向の依存関係を生み出し、契約上の危険を高める（Williamson，1991，282頁）。</w:t>
+        <w:t xml:space="preserve">資産特殊性とは、ある資産を、その生産的価値を損なうことなく、別の用途や別の使用者に転用できる程度を指す（Williamson，1991，281頁）。言い換えれば、特定の取引のために行われた投資が、他の用途や取引相手に転用された場合にどれだけ価値を失うかを示す概念である（Williamson，1991，282頁）。Williamson（1991，281-282頁）は資産特殊性を、①工程を隣接させて在庫や輸送の費用を節約する立地特殊性、②特殊な金型のような物的資産特殊性、③経験を通じた学習によって生じる人的資産特殊性、④ブランド資本、⑤特定の顧客の要請に応じて汎用的な設備に行われる投資である専用資産、⑥現場での適時の対応が不可欠となる時間的特殊性の六つに分類している。⑤の専用資産が示すように、汎用的な設備であっても、特定の顧客のために投資された場合には特殊性をもつ。すなわち資産特殊性は、資産が汎用的なものか特殊なものかという性質だけで決まるものではない。こうした資産特殊性、とりわけ①から⑤の形態は、取引当事者の間に双方向の依存関係を生み出し、契約上の危険を高める（Williamson，1991，282頁）。</w:t>
       </w:r>
     </w:p>
     <w:p>
@@ -112,16 +112,16 @@
         <w:jc w:val="both"/>
       </w:pPr>
       <w:r>
-        <w:t xml:space="preserve">取引費用論の中心的な仮説は、属性の異なる取引が、費用と能力の異なるガバナンス構造と、主として取引費用を節約するように対応づけられるというものである（Williamson，1991，277頁）。これを識別的整合（discriminating alignment）仮説という。基本的なガバナンス構造としては、市場、階層組織（企業内部）、そして両者の中間に位置するハイブリッドの三つが挙げられる。ハイブリッドには、長期契約、相互取引、規制、フランチャイズなどが含まれる（Williamson，1991，280頁）。</w:t>
-      </w:r>
-    </w:p>
-    <w:p>
-      <w:pPr>
-        <w:ind w:firstLine="210"/>
-        <w:jc w:val="both"/>
-      </w:pPr>
-      <w:r>
-        <w:t xml:space="preserve">Williamson（1991，278-280頁）によれば、三つのガバナンス構造は、主に適応の仕方とインセンティブ・管理の手段において異なる。適応には、価格の変化に応じて各当事者が自律的に対応する適応（A：autonomy）と、当事者間の調整を必要とする協調的な適応（C：cooperation）の二種類がある。市場は前者に優れ、強いインセンティブをもつ一方、階層組織は後者に優れ、監視などの管理的統制を強く用いることができるが、インセンティブは弱まる。ハイブリッドは、これらすべての点で市場と階層組織の中間的な性格をもつ（Williamson，1991，280-281頁）。これを整理したものが表2-1である。</w:t>
+        <w:t xml:space="preserve">ガバナンス構造とは、取引が組み込まれる制度的な枠組みであり（Williamson，1985，35頁）、潜在的な対立を事前に予見し、それを防止・緩和するために設計されるものである（Williamson，1985，29頁）。取引費用論の予測力の多くを支える識別的整合（discriminating alignment）仮説は、属性の異なる取引が、費用と能力の異なるガバナンス構造と、主として取引費用を節約するように対応づけられるとする（Williamson，1991，277頁）。基本的なガバナンス構造には、市場、階層組織（企業内部）、両者の中間に位置するハイブリッドの三つがあり、ハイブリッドには長期契約、相互取引、規制、フランチャイズなどが含まれる（Williamson，1991，280頁）。</w:t>
+      </w:r>
+    </w:p>
+    <w:p>
+      <w:pPr>
+        <w:ind w:firstLine="210"/>
+        <w:jc w:val="both"/>
+      </w:pPr>
+      <w:r>
+        <w:t xml:space="preserve">三つのガバナンス構造は、主に適応の仕方とインセンティブ・管理の手段において異なる（Williamson，1991，278-280頁）。適応には、価格の変化に応じて各当事者が自律的に対応する適応（A：autonomy）と、当事者間の調整を必要とする協調的な適応（C：cooperation）がある。市場は前者に優れ、強いインセンティブをもつ一方、階層組織は後者に優れ、監視などの管理的統制を強く用いることができるが、インセンティブは弱まる。ハイブリッドは、これらすべての点で両者の中間的な性格をもつ（Williamson，1991，280-281頁）。これを整理したものが表2-1である。</w:t>
       </w:r>
     </w:p>
     <w:p>
@@ -673,16 +673,16 @@
         <w:jc w:val="both"/>
       </w:pPr>
       <w:r>
-        <w:t xml:space="preserve">このような特徴の違いから、資産特殊性が低い取引では市場、中程度の取引ではハイブリッド、高い取引では階層組織が、それぞれ最も統治コストの低いガバナンス構造となる（Williamson，1991，284頁）。ただし、ハイブリッドは双方の合意を通じて適応する必要があるため、攪乱が頻繁に生じる場合には最も不利になりやすい（Williamson，1991，291頁）。</w:t>
-      </w:r>
-    </w:p>
-    <w:p>
-      <w:pPr>
-        <w:ind w:firstLine="210"/>
-        <w:jc w:val="both"/>
-      </w:pPr>
-      <w:r>
-        <w:t xml:space="preserve">本研究にとって重要なのは、同じハイブリッドの中にも管理の程度に差があるという点である。Williamson（1991，283頁）はフランチャイズをハイブリッドの例として挙げ、フランチャイジーは階層組織より大きな自律性をもつ一方で、市場取引と比べると追加的なルールや監視のもとに置かれると説明している。さらに、同じフランチャイズでも、統制の弱いものと強いものとでは、統治コストの曲線の位置が異なるとしている（Williamson，1991，284頁）。このことは、ガバナンス構造の違いを、市場・ハイブリッド・階層組織のいずれを選ぶかという問題だけでなく、同じ形態の中での管理の程度の違いとしても捉えられることを示している。本研究が、配送の担い手との契約形態に加えて、監視・管理の程度に着目するのはこのためである。</w:t>
+        <w:t xml:space="preserve">その結果、資産特殊性が低い取引では市場、中程度の取引ではハイブリッド、高い取引では階層組織が、それぞれ最も統治コストの低いガバナンス構造となる（Williamson，1991，284頁）。ただし、ハイブリッドは双方の合意を通じて適応する必要があるため、攪乱が頻繁に生じる場合に最も影響を受けやすいとされる（Williamson，1991，291頁）。</w:t>
+      </w:r>
+    </w:p>
+    <w:p>
+      <w:pPr>
+        <w:ind w:firstLine="210"/>
+        <w:jc w:val="both"/>
+      </w:pPr>
+      <w:r>
+        <w:t xml:space="preserve">本研究にとって重要なのは、同じハイブリッドの中にも管理の程度に差があるという点である。Williamson（1991，283頁）はフランチャイズをハイブリッドの例として挙げ、フランチャイジーは階層組織より大きな自律性をもつ一方で、市場取引と比べると追加的なルールや監視のもとに置かれると説明している。さらに、同じフランチャイズでも、統制の強いものは統制の弱いものよりも、資産特殊性の高い側に位置づけられている（Williamson，1991，284頁）。したがって、ガバナンス構造の違いは、市場・ハイブリッド・階層組織のいずれを選ぶかという問題だけでなく、同じ形態の中での管理の程度の違いとしても捉えられる。本研究が、配送の担い手との契約形態に加えて、監視・管理の程度に着目するのはこのためである。</w:t>
       </w:r>
     </w:p>
     <w:p>

</xml_diff>

<commit_message>
Restore original groupings in Table 2-1 and keep table together
Co-Authored-By: Claude Opus 5.5 <noreply@anthropic.com>
Claude-Session: https://claude.ai/code/session_01D75XZCNXPUXwLshn5jBJpA
</commit_message>
<xml_diff>
--- a/thesis/第2章_2.2_取引費用論.docx
+++ b/thesis/第2章_2.2_取引費用論.docx
@@ -126,6 +126,7 @@
     </w:p>
     <w:p>
       <w:pPr>
+        <w:keepNext/>
         <w:spacing w:before="120"/>
         <w:jc w:val="center"/>
       </w:pPr>
@@ -150,18 +151,49 @@
         </w:tblBorders>
       </w:tblPr>
       <w:tblGrid>
-        <w:gridCol w:w="2600"/>
-        <w:gridCol w:w="1900"/>
-        <w:gridCol w:w="1900"/>
-        <w:gridCol w:w="1900"/>
+        <w:gridCol w:w="1100"/>
+        <w:gridCol w:w="2200"/>
+        <w:gridCol w:w="1650"/>
+        <w:gridCol w:w="1650"/>
+        <w:gridCol w:w="1650"/>
       </w:tblGrid>
       <w:tr>
-        <w:tc>
-          <w:tcPr>
-            <w:tcW w:type="dxa" w:w="1900"/>
-          </w:tcPr>
-          <w:p>
-            <w:pPr>
+        <w:trPr>
+          <w:cantSplit/>
+          <w:tblHeader/>
+        </w:trPr>
+        <w:tc>
+          <w:tcPr>
+            <w:tcW w:type="dxa" w:w="1100"/>
+            <w:vAlign w:val="center"/>
+          </w:tcPr>
+          <w:p>
+            <w:pPr>
+              <w:keepNext/>
+              <w:keepLines/>
+              <w:spacing w:line="300" w:lineRule="exact"/>
+              <w:jc w:val="center"/>
+            </w:pPr>
+            <w:r>
+              <w:rPr>
+                <w:b w:val="false"/>
+                <w:bCs w:val="false"/>
+                <w:sz w:val="19"/>
+                <w:szCs w:val="19"/>
+              </w:rPr>
+              <w:t xml:space="preserve"/>
+            </w:r>
+          </w:p>
+        </w:tc>
+        <w:tc>
+          <w:tcPr>
+            <w:tcW w:type="dxa" w:w="2200"/>
+            <w:vAlign w:val="center"/>
+          </w:tcPr>
+          <w:p>
+            <w:pPr>
+              <w:keepNext/>
+              <w:keepLines/>
               <w:spacing w:line="300" w:lineRule="exact"/>
               <w:jc w:val="center"/>
             </w:pPr>
@@ -172,16 +204,19 @@
                 <w:sz w:val="19"/>
                 <w:szCs w:val="19"/>
               </w:rPr>
-              <w:t xml:space="preserve"/>
-            </w:r>
-          </w:p>
-        </w:tc>
-        <w:tc>
-          <w:tcPr>
-            <w:tcW w:type="dxa" w:w="1900"/>
-          </w:tcPr>
-          <w:p>
-            <w:pPr>
+              <w:t xml:space="preserve">属性</w:t>
+            </w:r>
+          </w:p>
+        </w:tc>
+        <w:tc>
+          <w:tcPr>
+            <w:tcW w:type="dxa" w:w="1650"/>
+            <w:vAlign w:val="center"/>
+          </w:tcPr>
+          <w:p>
+            <w:pPr>
+              <w:keepNext/>
+              <w:keepLines/>
               <w:spacing w:line="300" w:lineRule="exact"/>
               <w:jc w:val="center"/>
             </w:pPr>
@@ -198,10 +233,13 @@
         </w:tc>
         <w:tc>
           <w:tcPr>
-            <w:tcW w:type="dxa" w:w="1900"/>
-          </w:tcPr>
-          <w:p>
-            <w:pPr>
+            <w:tcW w:type="dxa" w:w="1650"/>
+            <w:vAlign w:val="center"/>
+          </w:tcPr>
+          <w:p>
+            <w:pPr>
+              <w:keepNext/>
+              <w:keepLines/>
               <w:spacing w:line="300" w:lineRule="exact"/>
               <w:jc w:val="center"/>
             </w:pPr>
@@ -218,10 +256,13 @@
         </w:tc>
         <w:tc>
           <w:tcPr>
-            <w:tcW w:type="dxa" w:w="1900"/>
-          </w:tcPr>
-          <w:p>
-            <w:pPr>
+            <w:tcW w:type="dxa" w:w="1650"/>
+            <w:vAlign w:val="center"/>
+          </w:tcPr>
+          <w:p>
+            <w:pPr>
+              <w:keepNext/>
+              <w:keepLines/>
               <w:spacing w:line="300" w:lineRule="exact"/>
               <w:jc w:val="center"/>
             </w:pPr>
@@ -238,12 +279,19 @@
         </w:tc>
       </w:tr>
       <w:tr>
-        <w:tc>
-          <w:tcPr>
-            <w:tcW w:type="dxa" w:w="1900"/>
-          </w:tcPr>
-          <w:p>
-            <w:pPr>
+        <w:trPr>
+          <w:cantSplit/>
+        </w:trPr>
+        <w:tc>
+          <w:tcPr>
+            <w:tcW w:type="dxa" w:w="1100"/>
+            <w:vMerge w:val="restart"/>
+            <w:vAlign w:val="center"/>
+          </w:tcPr>
+          <w:p>
+            <w:pPr>
+              <w:keepNext/>
+              <w:keepLines/>
               <w:spacing w:line="300" w:lineRule="exact"/>
               <w:jc w:val="center"/>
             </w:pPr>
@@ -254,16 +302,42 @@
                 <w:sz w:val="19"/>
                 <w:szCs w:val="19"/>
               </w:rPr>
+              <w:t xml:space="preserve">手段</w:t>
+            </w:r>
+          </w:p>
+        </w:tc>
+        <w:tc>
+          <w:tcPr>
+            <w:tcW w:type="dxa" w:w="2200"/>
+            <w:vAlign w:val="center"/>
+          </w:tcPr>
+          <w:p>
+            <w:pPr>
+              <w:keepNext/>
+              <w:keepLines/>
+              <w:spacing w:line="300" w:lineRule="exact"/>
+              <w:jc w:val="center"/>
+            </w:pPr>
+            <w:r>
+              <w:rPr>
+                <w:b/>
+                <w:bCs/>
+                <w:sz w:val="19"/>
+                <w:szCs w:val="19"/>
+              </w:rPr>
               <w:t xml:space="preserve">インセンティブの強さ</w:t>
             </w:r>
           </w:p>
         </w:tc>
         <w:tc>
           <w:tcPr>
-            <w:tcW w:type="dxa" w:w="1900"/>
-          </w:tcPr>
-          <w:p>
-            <w:pPr>
+            <w:tcW w:type="dxa" w:w="1650"/>
+            <w:vAlign w:val="center"/>
+          </w:tcPr>
+          <w:p>
+            <w:pPr>
+              <w:keepNext/>
+              <w:keepLines/>
               <w:spacing w:line="300" w:lineRule="exact"/>
               <w:jc w:val="center"/>
             </w:pPr>
@@ -280,10 +354,13 @@
         </w:tc>
         <w:tc>
           <w:tcPr>
-            <w:tcW w:type="dxa" w:w="1900"/>
-          </w:tcPr>
-          <w:p>
-            <w:pPr>
+            <w:tcW w:type="dxa" w:w="1650"/>
+            <w:vAlign w:val="center"/>
+          </w:tcPr>
+          <w:p>
+            <w:pPr>
+              <w:keepNext/>
+              <w:keepLines/>
               <w:spacing w:line="300" w:lineRule="exact"/>
               <w:jc w:val="center"/>
             </w:pPr>
@@ -300,10 +377,13 @@
         </w:tc>
         <w:tc>
           <w:tcPr>
-            <w:tcW w:type="dxa" w:w="1900"/>
-          </w:tcPr>
-          <w:p>
-            <w:pPr>
+            <w:tcW w:type="dxa" w:w="1650"/>
+            <w:vAlign w:val="center"/>
+          </w:tcPr>
+          <w:p>
+            <w:pPr>
+              <w:keepNext/>
+              <w:keepLines/>
               <w:spacing w:line="300" w:lineRule="exact"/>
               <w:jc w:val="center"/>
             </w:pPr>
@@ -320,12 +400,24 @@
         </w:tc>
       </w:tr>
       <w:tr>
-        <w:tc>
-          <w:tcPr>
-            <w:tcW w:type="dxa" w:w="1900"/>
-          </w:tcPr>
-          <w:p>
-            <w:pPr>
+        <w:trPr>
+          <w:cantSplit/>
+        </w:trPr>
+        <w:tc>
+          <w:tcPr>
+            <w:vMerge w:val="continue"/>
+          </w:tcPr>
+          <w:p/>
+        </w:tc>
+        <w:tc>
+          <w:tcPr>
+            <w:tcW w:type="dxa" w:w="2200"/>
+            <w:vAlign w:val="center"/>
+          </w:tcPr>
+          <w:p>
+            <w:pPr>
+              <w:keepNext/>
+              <w:keepLines/>
               <w:spacing w:line="300" w:lineRule="exact"/>
               <w:jc w:val="center"/>
             </w:pPr>
@@ -342,10 +434,13 @@
         </w:tc>
         <w:tc>
           <w:tcPr>
-            <w:tcW w:type="dxa" w:w="1900"/>
-          </w:tcPr>
-          <w:p>
-            <w:pPr>
+            <w:tcW w:type="dxa" w:w="1650"/>
+            <w:vAlign w:val="center"/>
+          </w:tcPr>
+          <w:p>
+            <w:pPr>
+              <w:keepNext/>
+              <w:keepLines/>
               <w:spacing w:line="300" w:lineRule="exact"/>
               <w:jc w:val="center"/>
             </w:pPr>
@@ -362,10 +457,13 @@
         </w:tc>
         <w:tc>
           <w:tcPr>
-            <w:tcW w:type="dxa" w:w="1900"/>
-          </w:tcPr>
-          <w:p>
-            <w:pPr>
+            <w:tcW w:type="dxa" w:w="1650"/>
+            <w:vAlign w:val="center"/>
+          </w:tcPr>
+          <w:p>
+            <w:pPr>
+              <w:keepNext/>
+              <w:keepLines/>
               <w:spacing w:line="300" w:lineRule="exact"/>
               <w:jc w:val="center"/>
             </w:pPr>
@@ -382,10 +480,13 @@
         </w:tc>
         <w:tc>
           <w:tcPr>
-            <w:tcW w:type="dxa" w:w="1900"/>
-          </w:tcPr>
-          <w:p>
-            <w:pPr>
+            <w:tcW w:type="dxa" w:w="1650"/>
+            <w:vAlign w:val="center"/>
+          </w:tcPr>
+          <w:p>
+            <w:pPr>
+              <w:keepNext/>
+              <w:keepLines/>
               <w:spacing w:line="300" w:lineRule="exact"/>
               <w:jc w:val="center"/>
             </w:pPr>
@@ -402,12 +503,19 @@
         </w:tc>
       </w:tr>
       <w:tr>
-        <w:tc>
-          <w:tcPr>
-            <w:tcW w:type="dxa" w:w="1900"/>
-          </w:tcPr>
-          <w:p>
-            <w:pPr>
+        <w:trPr>
+          <w:cantSplit/>
+        </w:trPr>
+        <w:tc>
+          <w:tcPr>
+            <w:tcW w:type="dxa" w:w="1100"/>
+            <w:vMerge w:val="restart"/>
+            <w:vAlign w:val="center"/>
+          </w:tcPr>
+          <w:p>
+            <w:pPr>
+              <w:keepNext/>
+              <w:keepLines/>
               <w:spacing w:line="300" w:lineRule="exact"/>
               <w:jc w:val="center"/>
             </w:pPr>
@@ -418,16 +526,42 @@
                 <w:sz w:val="19"/>
                 <w:szCs w:val="19"/>
               </w:rPr>
+              <w:t xml:space="preserve">成果属性</w:t>
+            </w:r>
+          </w:p>
+        </w:tc>
+        <w:tc>
+          <w:tcPr>
+            <w:tcW w:type="dxa" w:w="2200"/>
+            <w:vAlign w:val="center"/>
+          </w:tcPr>
+          <w:p>
+            <w:pPr>
+              <w:keepNext/>
+              <w:keepLines/>
+              <w:spacing w:line="300" w:lineRule="exact"/>
+              <w:jc w:val="center"/>
+            </w:pPr>
+            <w:r>
+              <w:rPr>
+                <w:b/>
+                <w:bCs/>
+                <w:sz w:val="19"/>
+                <w:szCs w:val="19"/>
+              </w:rPr>
               <w:t xml:space="preserve">自律的適応（A）</w:t>
             </w:r>
           </w:p>
         </w:tc>
         <w:tc>
           <w:tcPr>
-            <w:tcW w:type="dxa" w:w="1900"/>
-          </w:tcPr>
-          <w:p>
-            <w:pPr>
+            <w:tcW w:type="dxa" w:w="1650"/>
+            <w:vAlign w:val="center"/>
+          </w:tcPr>
+          <w:p>
+            <w:pPr>
+              <w:keepNext/>
+              <w:keepLines/>
               <w:spacing w:line="300" w:lineRule="exact"/>
               <w:jc w:val="center"/>
             </w:pPr>
@@ -444,10 +578,13 @@
         </w:tc>
         <w:tc>
           <w:tcPr>
-            <w:tcW w:type="dxa" w:w="1900"/>
-          </w:tcPr>
-          <w:p>
-            <w:pPr>
+            <w:tcW w:type="dxa" w:w="1650"/>
+            <w:vAlign w:val="center"/>
+          </w:tcPr>
+          <w:p>
+            <w:pPr>
+              <w:keepNext/>
+              <w:keepLines/>
               <w:spacing w:line="300" w:lineRule="exact"/>
               <w:jc w:val="center"/>
             </w:pPr>
@@ -464,10 +601,13 @@
         </w:tc>
         <w:tc>
           <w:tcPr>
-            <w:tcW w:type="dxa" w:w="1900"/>
-          </w:tcPr>
-          <w:p>
-            <w:pPr>
+            <w:tcW w:type="dxa" w:w="1650"/>
+            <w:vAlign w:val="center"/>
+          </w:tcPr>
+          <w:p>
+            <w:pPr>
+              <w:keepNext/>
+              <w:keepLines/>
               <w:spacing w:line="300" w:lineRule="exact"/>
               <w:jc w:val="center"/>
             </w:pPr>
@@ -484,12 +624,24 @@
         </w:tc>
       </w:tr>
       <w:tr>
-        <w:tc>
-          <w:tcPr>
-            <w:tcW w:type="dxa" w:w="1900"/>
-          </w:tcPr>
-          <w:p>
-            <w:pPr>
+        <w:trPr>
+          <w:cantSplit/>
+        </w:trPr>
+        <w:tc>
+          <w:tcPr>
+            <w:vMerge w:val="continue"/>
+          </w:tcPr>
+          <w:p/>
+        </w:tc>
+        <w:tc>
+          <w:tcPr>
+            <w:tcW w:type="dxa" w:w="2200"/>
+            <w:vAlign w:val="center"/>
+          </w:tcPr>
+          <w:p>
+            <w:pPr>
+              <w:keepNext/>
+              <w:keepLines/>
               <w:spacing w:line="300" w:lineRule="exact"/>
               <w:jc w:val="center"/>
             </w:pPr>
@@ -506,10 +658,13 @@
         </w:tc>
         <w:tc>
           <w:tcPr>
-            <w:tcW w:type="dxa" w:w="1900"/>
-          </w:tcPr>
-          <w:p>
-            <w:pPr>
+            <w:tcW w:type="dxa" w:w="1650"/>
+            <w:vAlign w:val="center"/>
+          </w:tcPr>
+          <w:p>
+            <w:pPr>
+              <w:keepNext/>
+              <w:keepLines/>
               <w:spacing w:line="300" w:lineRule="exact"/>
               <w:jc w:val="center"/>
             </w:pPr>
@@ -526,10 +681,13 @@
         </w:tc>
         <w:tc>
           <w:tcPr>
-            <w:tcW w:type="dxa" w:w="1900"/>
-          </w:tcPr>
-          <w:p>
-            <w:pPr>
+            <w:tcW w:type="dxa" w:w="1650"/>
+            <w:vAlign w:val="center"/>
+          </w:tcPr>
+          <w:p>
+            <w:pPr>
+              <w:keepNext/>
+              <w:keepLines/>
               <w:spacing w:line="300" w:lineRule="exact"/>
               <w:jc w:val="center"/>
             </w:pPr>
@@ -546,10 +704,13 @@
         </w:tc>
         <w:tc>
           <w:tcPr>
-            <w:tcW w:type="dxa" w:w="1900"/>
-          </w:tcPr>
-          <w:p>
-            <w:pPr>
+            <w:tcW w:type="dxa" w:w="1650"/>
+            <w:vAlign w:val="center"/>
+          </w:tcPr>
+          <w:p>
+            <w:pPr>
+              <w:keepNext/>
+              <w:keepLines/>
               <w:spacing w:line="300" w:lineRule="exact"/>
               <w:jc w:val="center"/>
             </w:pPr>
@@ -566,12 +727,24 @@
         </w:tc>
       </w:tr>
       <w:tr>
-        <w:tc>
-          <w:tcPr>
-            <w:tcW w:type="dxa" w:w="1900"/>
-          </w:tcPr>
-          <w:p>
-            <w:pPr>
+        <w:trPr>
+          <w:cantSplit/>
+        </w:trPr>
+        <w:tc>
+          <w:tcPr>
+            <w:vMerge w:val="continue"/>
+          </w:tcPr>
+          <w:p/>
+        </w:tc>
+        <w:tc>
+          <w:tcPr>
+            <w:tcW w:type="dxa" w:w="2200"/>
+            <w:vAlign w:val="center"/>
+          </w:tcPr>
+          <w:p>
+            <w:pPr>
+              <w:keepNext/>
+              <w:keepLines/>
               <w:spacing w:line="300" w:lineRule="exact"/>
               <w:jc w:val="center"/>
             </w:pPr>
@@ -588,10 +761,13 @@
         </w:tc>
         <w:tc>
           <w:tcPr>
-            <w:tcW w:type="dxa" w:w="1900"/>
-          </w:tcPr>
-          <w:p>
-            <w:pPr>
+            <w:tcW w:type="dxa" w:w="1650"/>
+            <w:vAlign w:val="center"/>
+          </w:tcPr>
+          <w:p>
+            <w:pPr>
+              <w:keepNext/>
+              <w:keepLines/>
               <w:spacing w:line="300" w:lineRule="exact"/>
               <w:jc w:val="center"/>
             </w:pPr>
@@ -608,10 +784,13 @@
         </w:tc>
         <w:tc>
           <w:tcPr>
-            <w:tcW w:type="dxa" w:w="1900"/>
-          </w:tcPr>
-          <w:p>
-            <w:pPr>
+            <w:tcW w:type="dxa" w:w="1650"/>
+            <w:vAlign w:val="center"/>
+          </w:tcPr>
+          <w:p>
+            <w:pPr>
+              <w:keepNext/>
+              <w:keepLines/>
               <w:spacing w:line="300" w:lineRule="exact"/>
               <w:jc w:val="center"/>
             </w:pPr>
@@ -628,10 +807,13 @@
         </w:tc>
         <w:tc>
           <w:tcPr>
-            <w:tcW w:type="dxa" w:w="1900"/>
-          </w:tcPr>
-          <w:p>
-            <w:pPr>
+            <w:tcW w:type="dxa" w:w="1650"/>
+            <w:vAlign w:val="center"/>
+          </w:tcPr>
+          <w:p>
+            <w:pPr>
+              <w:keepNext/>
+              <w:keepLines/>
               <w:spacing w:line="300" w:lineRule="exact"/>
               <w:jc w:val="center"/>
             </w:pPr>

</xml_diff>

<commit_message>
Fix Table 2-1 grouping: contract law as its own category
Co-Authored-By: Claude Opus 5.5 <noreply@anthropic.com>
Claude-Session: https://claude.ai/code/session_01D75XZCNXPUXwLshn5jBJpA
</commit_message>
<xml_diff>
--- a/thesis/第2章_2.2_取引費用論.docx
+++ b/thesis/第2章_2.2_取引費用論.docx
@@ -732,13 +732,8 @@
         </w:trPr>
         <w:tc>
           <w:tcPr>
-            <w:vMerge w:val="continue"/>
-          </w:tcPr>
-          <w:p/>
-        </w:tc>
-        <w:tc>
-          <w:tcPr>
-            <w:tcW w:type="dxa" w:w="2200"/>
+            <w:tcW w:type="dxa" w:w="3300"/>
+            <w:gridSpan w:val="2"/>
             <w:vAlign w:val="center"/>
           </w:tcPr>
           <w:p>

</xml_diff>

<commit_message>
Align 2.2.3 text with Table 2-1 groupings
Co-Authored-By: Claude Opus 5.5 <noreply@anthropic.com>
Claude-Session: https://claude.ai/code/session_01D75XZCNXPUXwLshn5jBJpA
</commit_message>
<xml_diff>
--- a/thesis/第2章_2.2_取引費用論.docx
+++ b/thesis/第2章_2.2_取引費用論.docx
@@ -121,7 +121,7 @@
         <w:jc w:val="both"/>
       </w:pPr>
       <w:r>
-        <w:t xml:space="preserve">三つのガバナンス構造は、主に適応の仕方とインセンティブ・管理の手段において異なる（Williamson，1991，278-280頁）。適応には、価格の変化に応じて各当事者が自律的に対応する適応（A：autonomy）と、当事者間の調整を必要とする協調的な適応（C：cooperation）がある。市場は前者に優れ、強いインセンティブをもつ一方、階層組織は後者に優れ、監視などの管理的統制を強く用いることができるが、インセンティブは弱まる。ハイブリッドは、これらすべての点で両者の中間的な性格をもつ（Williamson，1991，280-281頁）。これを整理したものが表2-1である。</w:t>
+        <w:t xml:space="preserve">三つのガバナンス構造は、インセンティブや管理的統制といった手段、適応能力、そして依拠する契約法において異なる（Williamson，1991，277-281頁）。適応には、価格の変化に応じて各当事者が自律的に対応する適応（A：autonomy）と、当事者間の調整を必要とする協調的な適応（C：cooperation）がある。市場は前者に優れ、強いインセンティブをもつ一方、階層組織は後者に優れ、監視などの管理的統制を強く用いることができるが、インセンティブは弱まる。ハイブリッドは、これらすべての点で両者の中間的な性格をもつ（Williamson，1991，280-281頁）。これを整理したものが表2-1である。</w:t>
       </w:r>
     </w:p>
     <w:p>
@@ -831,7 +831,7 @@
           <w:sz w:val="18"/>
           <w:szCs w:val="18"/>
         </w:rPr>
-        <w:t xml:space="preserve">（注）＋＋＝強い，＋＝中程度，０＝弱い。</w:t>
+        <w:t xml:space="preserve">（注）＋＋＝強い，＋＝中程度，０＝弱い。成果属性は適応能力を，契約法は法的な契約への依拠の強さを示す。</w:t>
       </w:r>
     </w:p>
     <w:p>

</xml_diff>

<commit_message>
Relabel Table 2-1 group as 適応能力
Co-Authored-By: Claude Opus 5.5 <noreply@anthropic.com>
Claude-Session: https://claude.ai/code/session_01D75XZCNXPUXwLshn5jBJpA
</commit_message>
<xml_diff>
--- a/thesis/第2章_2.2_取引費用論.docx
+++ b/thesis/第2章_2.2_取引費用論.docx
@@ -526,7 +526,7 @@
                 <w:sz w:val="19"/>
                 <w:szCs w:val="19"/>
               </w:rPr>
-              <w:t xml:space="preserve">成果属性</w:t>
+              <w:t xml:space="preserve">適応能力</w:t>
             </w:r>
           </w:p>
         </w:tc>
@@ -831,7 +831,7 @@
           <w:sz w:val="18"/>
           <w:szCs w:val="18"/>
         </w:rPr>
-        <w:t xml:space="preserve">（注）＋＋＝強い，＋＝中程度，０＝弱い。成果属性は適応能力を，契約法は法的な契約への依拠の強さを示す。</w:t>
+        <w:t xml:space="preserve">（注）＋＋＝強い，＋＝中程度，０＝弱い。契約法は法的な契約への依拠の強さを示す。</w:t>
       </w:r>
     </w:p>
     <w:p>

</xml_diff>

<commit_message>
Revise Section 2.2.4 for accuracy to Williamson (1991)
Co-Authored-By: Claude Opus 5.5 <noreply@anthropic.com>
Claude-Session: https://claude.ai/code/session_01D75XZCNXPUXwLshn5jBJpA
</commit_message>
<xml_diff>
--- a/thesis/第2章_2.2_取引費用論.docx
+++ b/thesis/第2章_2.2_取引費用論.docx
@@ -876,16 +876,16 @@
         <w:jc w:val="both"/>
       </w:pPr>
       <w:r>
-        <w:t xml:space="preserve">Williamson（1991，287頁）は、Davis &amp; North（1971）にならい、生産、交換、分配の基礎となる政治的・社会的・法的な基本ルールの集合を制度的環境と呼んでいる。そのうえで、制度的環境を、ガバナンス構造の相対的な統治コストを変化させるパラメータ（shift parameters）として位置づけている（同上）。具体的には、財産権、契約法、評判効果、不確実性の四つの変化が検討されている（同上）。また、市場・ハイブリッド・階層組織の三つを想定すると、市場から階層組織へ移行するには大きな環境変化が必要であるのに対し、市場からハイブリッドへ、あるいはハイブリッドから階層組織への移行は、より小さな変化によっても生じうるとされる（同上）。</w:t>
-      </w:r>
-    </w:p>
-    <w:p>
-      <w:pPr>
-        <w:ind w:firstLine="210"/>
-        <w:jc w:val="both"/>
-      </w:pPr>
-      <w:r>
-        <w:t xml:space="preserve">さらにWilliamson（1991，293-294頁）は、日本企業の雇用、下請、銀行取引の慣行が相互に補完的な関係にあることに触れ、個々の慣行だけを他国にそのまま移植しても最適にはならないと指摘している。そのうえで、制度の分析を応用する際には、資本主義の形態ごとの文脈の違いを考慮する必要があると述べている（Williamson，1991，294頁）。</w:t>
+        <w:t xml:space="preserve">Williamson（1991，287頁）は、Davis &amp; North（1971）の定義を引用し、生産、交換、分配の基礎となる政治的・社会的・法的な基本ルールの集合を制度的環境と呼んでいる。そのうえで、制度的環境を、ガバナンス構造の相対的な統治コストを変化させるパラメータ（shift parameters）として位置づけ、財産権、契約法、評判効果、不確実性の四つの変化を検討している。また、市場・ハイブリッド・階層組織の三つを想定すると、市場から階層組織への移行（またはその逆）には大きなパラメータの変化が必要であるのに対し、市場からハイブリッドへ、あるいはハイブリッドから階層組織への移行は、より小さな変化によっても生じうるとしている（同上）。</w:t>
+      </w:r>
+    </w:p>
+    <w:p>
+      <w:pPr>
+        <w:ind w:firstLine="210"/>
+        <w:jc w:val="both"/>
+      </w:pPr>
+      <w:r>
+        <w:t xml:space="preserve">さらにWilliamson（1991，293-294頁）は、日本企業の雇用、下請、銀行取引の慣行が相互に補完的な関係にあることに触れ、慣行間の結びつきが重要である場合には、個々の慣行だけを他国にそのまま移植しても最適にはならないと指摘している。そのうえで、経済改革への応用にあたっては、資本主義の形態ごとの文脈の違いを明示的に考慮する必要があると述べている（Williamson，1991，294頁）。</w:t>
       </w:r>
     </w:p>
     <w:p>

</xml_diff>